<commit_message>
Parte1 y 2 terminadas (Andrés)
Parte1 y 2 terminadas (Andrés) y corregido archivo carga_masiva.sql
</commit_message>
<xml_diff>
--- a/Tabla de resultados seccion  2.docx
+++ b/Tabla de resultados seccion  2.docx
@@ -253,7 +253,7 @@
               <w:rPr>
                 <w:lang w:val="es-ES"/>
               </w:rPr>
-              <w:t>Parallel</w:t>
+              <w:t>Seq</w:t>
             </w:r>
             <w:proofErr w:type="spellEnd"/>
             <w:r>
@@ -267,7 +267,7 @@
               <w:rPr>
                 <w:lang w:val="es-ES"/>
               </w:rPr>
-              <w:t>Seq</w:t>
+              <w:t>Scan</w:t>
             </w:r>
             <w:proofErr w:type="spellEnd"/>
             <w:r>
@@ -281,14 +281,28 @@
               <w:rPr>
                 <w:lang w:val="es-ES"/>
               </w:rPr>
-              <w:t>ScanCost</w:t>
-            </w:r>
-            <w:proofErr w:type="spellEnd"/>
-            <w:r>
-              <w:rPr>
-                <w:lang w:val="es-ES"/>
-              </w:rPr>
-              <w:t>: 6398.79Tiempo: 38.501 ms</w:t>
+              <w:t>on</w:t>
+            </w:r>
+            <w:proofErr w:type="spellEnd"/>
+            <w:r>
+              <w:rPr>
+                <w:lang w:val="es-ES"/>
+              </w:rPr>
+              <w:t xml:space="preserve"> </w:t>
+            </w:r>
+            <w:proofErr w:type="spellStart"/>
+            <w:r>
+              <w:rPr>
+                <w:lang w:val="es-ES"/>
+              </w:rPr>
+              <w:t>pedidoCost</w:t>
+            </w:r>
+            <w:proofErr w:type="spellEnd"/>
+            <w:r>
+              <w:rPr>
+                <w:lang w:val="es-ES"/>
+              </w:rPr>
+              <w:t>: 8304.72Tiempo: 27.237 ms</w:t>
             </w:r>
           </w:p>
         </w:tc>
@@ -330,15 +344,15 @@
           </w:tcPr>
           <w:p>
             <w:r>
-              <w:t xml:space="preserve">Index Scan </w:t>
-            </w:r>
-            <w:proofErr w:type="spellStart"/>
-            <w:r>
-              <w:t>BackwardCost</w:t>
-            </w:r>
-            <w:proofErr w:type="spellEnd"/>
-            <w:r>
-              <w:t xml:space="preserve">: 16.62Tiempo: 0.095 </w:t>
+              <w:t xml:space="preserve">Bitmap Heap Scan on </w:t>
+            </w:r>
+            <w:proofErr w:type="spellStart"/>
+            <w:r>
+              <w:t>pedidoCost</w:t>
+            </w:r>
+            <w:proofErr w:type="spellEnd"/>
+            <w:r>
+              <w:t xml:space="preserve">: 6280.56Tiempo: 12.818 </w:t>
             </w:r>
             <w:proofErr w:type="spellStart"/>
             <w:r>
@@ -361,7 +375,7 @@
               <w:rPr>
                 <w:lang w:val="es-ES"/>
               </w:rPr>
-              <w:t>~405x más rápido (reducción drástica de I/O de 3932 a 2 buffers).</w:t>
+              <w:t>~2.1x más rápido (reducido a la mitad el acceso a buffers en pedido).</w:t>
             </w:r>
           </w:p>
         </w:tc>
@@ -505,49 +519,7 @@
               <w:rPr>
                 <w:lang w:val="es-ES"/>
               </w:rPr>
-              <w:t xml:space="preserve"> prefirió mantener </w:t>
-            </w:r>
-            <w:proofErr w:type="spellStart"/>
-            <w:r>
-              <w:rPr>
-                <w:lang w:val="es-ES"/>
-              </w:rPr>
-              <w:t>Bitmap</w:t>
-            </w:r>
-            <w:proofErr w:type="spellEnd"/>
-            <w:r>
-              <w:rPr>
-                <w:lang w:val="es-ES"/>
-              </w:rPr>
-              <w:t xml:space="preserve"> </w:t>
-            </w:r>
-            <w:proofErr w:type="spellStart"/>
-            <w:r>
-              <w:rPr>
-                <w:lang w:val="es-ES"/>
-              </w:rPr>
-              <w:t>Index</w:t>
-            </w:r>
-            <w:proofErr w:type="spellEnd"/>
-            <w:r>
-              <w:rPr>
-                <w:lang w:val="es-ES"/>
-              </w:rPr>
-              <w:t xml:space="preserve"> </w:t>
-            </w:r>
-            <w:proofErr w:type="spellStart"/>
-            <w:r>
-              <w:rPr>
-                <w:lang w:val="es-ES"/>
-              </w:rPr>
-              <w:t>Scan</w:t>
-            </w:r>
-            <w:proofErr w:type="spellEnd"/>
-            <w:r>
-              <w:rPr>
-                <w:lang w:val="es-ES"/>
-              </w:rPr>
-              <w:t xml:space="preserve"> + </w:t>
+              <w:t xml:space="preserve"> mantiene </w:t>
             </w:r>
             <w:proofErr w:type="spellStart"/>
             <w:r>
@@ -561,7 +533,7 @@
               <w:rPr>
                 <w:lang w:val="es-ES"/>
               </w:rPr>
-              <w:t xml:space="preserve"> en memoria por el bajo volumen de filas por categoría (~8.300).</w:t>
+              <w:t xml:space="preserve"> en RAM por bajo costo.</w:t>
             </w:r>
           </w:p>
         </w:tc>
@@ -745,7 +717,7 @@
               <w:rPr>
                 <w:lang w:val="es-ES"/>
               </w:rPr>
-              <w:t xml:space="preserve">~1.4x más rápido en disco (0 </w:t>
+              <w:t xml:space="preserve">~1.4x más rápido (0 </w:t>
             </w:r>
             <w:proofErr w:type="spellStart"/>
             <w:r>
@@ -773,7 +745,7 @@
               <w:rPr>
                 <w:lang w:val="es-ES"/>
               </w:rPr>
-              <w:t xml:space="preserve"> en pedido).</w:t>
+              <w:t xml:space="preserve"> en la tabla pedido).</w:t>
             </w:r>
             <w:bookmarkStart w:id="0" w:name="_GoBack"/>
             <w:bookmarkEnd w:id="0"/>

</xml_diff>